<commit_message>
chore: Clean up junk files, add temp PDF auto-cleanup, update .gitignore
</commit_message>
<xml_diff>
--- a/อื่นๆ/รูปเล่ม.docx
+++ b/อื่นๆ/รูปเล่ม.docx
@@ -7241,11 +7241,15 @@
         <w:jc w:val="thaiDistribute"/>
         <w:rPr>
           <w:rFonts w:ascii="TH SarabunPSK" w:hAnsi="TH SarabunPSK" w:cs="TH SarabunPSK"/>
-        </w:rPr>
-      </w:pPr>
-      <w:r>
-        <w:rPr>
-          <w:rFonts w:ascii="TH SarabunPSK" w:hAnsi="TH SarabunPSK" w:cs="TH SarabunPSK" w:hint="cs"/>
+          <w:sz w:val="28"/>
+          <w:szCs w:val="32"/>
+        </w:rPr>
+      </w:pPr>
+      <w:r>
+        <w:rPr>
+          <w:rFonts w:ascii="TH SarabunPSK" w:hAnsi="TH SarabunPSK" w:cs="TH SarabunPSK" w:hint="cs"/>
+          <w:sz w:val="28"/>
+          <w:szCs w:val="32"/>
           <w:cs/>
         </w:rPr>
         <w:t>ขั้นตอนการทำงานหลักของระบบในการสั่งจ่ายยาเคมีบำบัด มีลำดับกระบวนการดังนี้</w:t>
@@ -11505,16 +11509,16 @@
         <mc:AlternateContent>
           <mc:Choice Requires="wps">
             <w:drawing>
-              <wp:anchor distT="0" distB="0" distL="114300" distR="114300" simplePos="0" relativeHeight="251687936" behindDoc="0" locked="0" layoutInCell="1" allowOverlap="1" wp14:anchorId="00FD9446" wp14:editId="04C17EA6">
+              <wp:anchor distT="0" distB="0" distL="114300" distR="114300" simplePos="0" relativeHeight="251687936" behindDoc="0" locked="0" layoutInCell="1" allowOverlap="1" wp14:anchorId="00FD9446" wp14:editId="2BD2ABF7">
                 <wp:simplePos x="0" y="0"/>
                 <wp:positionH relativeFrom="margin">
                   <wp:align>center</wp:align>
                 </wp:positionH>
                 <wp:positionV relativeFrom="paragraph">
-                  <wp:posOffset>1225550</wp:posOffset>
+                  <wp:posOffset>1222375</wp:posOffset>
                 </wp:positionV>
-                <wp:extent cx="4106173" cy="635"/>
-                <wp:effectExtent l="0" t="0" r="8890" b="6985"/>
+                <wp:extent cx="2380891" cy="635"/>
+                <wp:effectExtent l="0" t="0" r="635" b="6985"/>
                 <wp:wrapNone/>
                 <wp:docPr id="1891836100" name="Text Box 1"/>
                 <wp:cNvGraphicFramePr/>
@@ -11525,7 +11529,7 @@
                       <wps:spPr>
                         <a:xfrm>
                           <a:off x="0" y="0"/>
-                          <a:ext cx="4106173" cy="635"/>
+                          <a:ext cx="2380891" cy="635"/>
                         </a:xfrm>
                         <a:prstGeom prst="rect">
                           <a:avLst/>
@@ -11559,7 +11563,7 @@
                                 <w:szCs w:val="32"/>
                                 <w:cs/>
                               </w:rPr>
-                              <w:t>ภาพที่ 4.9 หน้าจอประวัติการทำรายการและรูปแบบฉลากยาสำหรับการพิมพ์</w:t>
+                              <w:t>ภาพที่ 4.9 รูปแบบฉลากยาสำหรับการพิมพ์</w:t>
                             </w:r>
                           </w:p>
                         </w:txbxContent>
@@ -11581,7 +11585,7 @@
           </mc:Choice>
           <mc:Fallback>
             <w:pict>
-              <v:shape w14:anchorId="00FD9446" id="_x0000_s1034" type="#_x0000_t202" style="position:absolute;margin-left:0;margin-top:96.5pt;width:323.3pt;height:.05pt;z-index:251687936;visibility:visible;mso-wrap-style:square;mso-width-percent:0;mso-wrap-distance-left:9pt;mso-wrap-distance-top:0;mso-wrap-distance-right:9pt;mso-wrap-distance-bottom:0;mso-position-horizontal:center;mso-position-horizontal-relative:margin;mso-position-vertical:absolute;mso-position-vertical-relative:text;mso-width-percent:0;mso-width-relative:margin;v-text-anchor:top" o:gfxdata="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" stroked="f">
+              <v:shape w14:anchorId="00FD9446" id="_x0000_s1034" type="#_x0000_t202" style="position:absolute;margin-left:0;margin-top:96.25pt;width:187.45pt;height:.05pt;z-index:251687936;visibility:visible;mso-wrap-style:square;mso-width-percent:0;mso-wrap-distance-left:9pt;mso-wrap-distance-top:0;mso-wrap-distance-right:9pt;mso-wrap-distance-bottom:0;mso-position-horizontal:center;mso-position-horizontal-relative:margin;mso-position-vertical:absolute;mso-position-vertical-relative:text;mso-width-percent:0;mso-width-relative:margin;v-text-anchor:top" o:gfxdata="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" stroked="f">
                 <v:textbox style="mso-fit-shape-to-text:t" inset="0,0,0,0">
                   <w:txbxContent>
                     <w:p>
@@ -11604,7 +11608,7 @@
                           <w:szCs w:val="32"/>
                           <w:cs/>
                         </w:rPr>
-                        <w:t>ภาพที่ 4.9 หน้าจอประวัติการทำรายการและรูปแบบฉลากยาสำหรับการพิมพ์</w:t>
+                        <w:t>ภาพที่ 4.9 รูปแบบฉลากยาสำหรับการพิมพ์</w:t>
                       </w:r>
                     </w:p>
                   </w:txbxContent>
@@ -11633,13 +11637,404 @@
           <w:szCs w:val="40"/>
         </w:rPr>
       </w:pPr>
-      <w:r>
-        <w:rPr>
-          <w:rFonts w:ascii="TH SarabunPSK" w:hAnsi="TH SarabunPSK" w:cs="TH SarabunPSK" w:hint="cs"/>
+    </w:p>
+    <w:p>
+      <w:pPr>
+        <w:jc w:val="center"/>
+        <w:rPr>
+          <w:rFonts w:ascii="TH SarabunPSK" w:hAnsi="TH SarabunPSK" w:cs="TH SarabunPSK"/>
           <w:b/>
           <w:bCs/>
           <w:sz w:val="40"/>
           <w:szCs w:val="40"/>
+        </w:rPr>
+      </w:pPr>
+      <w:r>
+        <w:rPr>
+          <w:noProof/>
+        </w:rPr>
+        <mc:AlternateContent>
+          <mc:Choice Requires="wps">
+            <w:drawing>
+              <wp:anchor distT="0" distB="0" distL="114300" distR="114300" simplePos="0" relativeHeight="251691008" behindDoc="0" locked="0" layoutInCell="1" allowOverlap="1" wp14:anchorId="5DCCB0E4" wp14:editId="677B42A9">
+                <wp:simplePos x="0" y="0"/>
+                <wp:positionH relativeFrom="column">
+                  <wp:posOffset>104140</wp:posOffset>
+                </wp:positionH>
+                <wp:positionV relativeFrom="paragraph">
+                  <wp:posOffset>2502535</wp:posOffset>
+                </wp:positionV>
+                <wp:extent cx="5735955" cy="635"/>
+                <wp:effectExtent l="0" t="0" r="0" b="0"/>
+                <wp:wrapNone/>
+                <wp:docPr id="899648695" name="Text Box 1"/>
+                <wp:cNvGraphicFramePr/>
+                <a:graphic xmlns:a="http://schemas.openxmlformats.org/drawingml/2006/main">
+                  <a:graphicData uri="http://schemas.microsoft.com/office/word/2010/wordprocessingShape">
+                    <wps:wsp>
+                      <wps:cNvSpPr txBox="1"/>
+                      <wps:spPr>
+                        <a:xfrm>
+                          <a:off x="0" y="0"/>
+                          <a:ext cx="5735955" cy="635"/>
+                        </a:xfrm>
+                        <a:prstGeom prst="rect">
+                          <a:avLst/>
+                        </a:prstGeom>
+                        <a:solidFill>
+                          <a:prstClr val="white"/>
+                        </a:solidFill>
+                        <a:ln>
+                          <a:noFill/>
+                        </a:ln>
+                      </wps:spPr>
+                      <wps:txbx>
+                        <w:txbxContent>
+                          <w:p>
+                            <w:pPr>
+                              <w:pStyle w:val="Caption"/>
+                              <w:jc w:val="center"/>
+                              <w:rPr>
+                                <w:rFonts w:ascii="TH SarabunPSK" w:hAnsi="TH SarabunPSK" w:cs="TH SarabunPSK" w:hint="cs"/>
+                                <w:b/>
+                                <w:bCs/>
+                                <w:sz w:val="32"/>
+                                <w:szCs w:val="32"/>
+                              </w:rPr>
+                            </w:pPr>
+                            <w:r>
+                              <w:rPr>
+                                <w:rFonts w:ascii="TH SarabunPSK" w:hAnsi="TH SarabunPSK" w:cs="TH SarabunPSK" w:hint="cs"/>
+                                <w:noProof/>
+                                <w:sz w:val="32"/>
+                                <w:szCs w:val="32"/>
+                                <w:cs/>
+                              </w:rPr>
+                              <w:t>ภาพที่ 4.10 หน้าจอประวัติการทำรายการย้อนหลัง</w:t>
+                            </w:r>
+                          </w:p>
+                        </w:txbxContent>
+                      </wps:txbx>
+                      <wps:bodyPr rot="0" spcFirstLastPara="0" vertOverflow="overflow" horzOverflow="overflow" vert="horz" wrap="square" lIns="0" tIns="0" rIns="0" bIns="0" numCol="1" spcCol="0" rtlCol="0" fromWordArt="0" anchor="t" anchorCtr="0" forceAA="0" compatLnSpc="1">
+                        <a:prstTxWarp prst="textNoShape">
+                          <a:avLst/>
+                        </a:prstTxWarp>
+                        <a:spAutoFit/>
+                      </wps:bodyPr>
+                    </wps:wsp>
+                  </a:graphicData>
+                </a:graphic>
+              </wp:anchor>
+            </w:drawing>
+          </mc:Choice>
+          <mc:Fallback>
+            <w:pict>
+              <v:shape w14:anchorId="5DCCB0E4" id="_x0000_s1035" type="#_x0000_t202" style="position:absolute;left:0;text-align:left;margin-left:8.2pt;margin-top:197.05pt;width:451.65pt;height:.05pt;z-index:251691008;visibility:visible;mso-wrap-style:square;mso-wrap-distance-left:9pt;mso-wrap-distance-top:0;mso-wrap-distance-right:9pt;mso-wrap-distance-bottom:0;mso-position-horizontal:absolute;mso-position-horizontal-relative:text;mso-position-vertical:absolute;mso-position-vertical-relative:text;v-text-anchor:top" o:gfxdata="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" stroked="f">
+                <v:textbox style="mso-fit-shape-to-text:t" inset="0,0,0,0">
+                  <w:txbxContent>
+                    <w:p>
+                      <w:pPr>
+                        <w:pStyle w:val="Caption"/>
+                        <w:jc w:val="center"/>
+                        <w:rPr>
+                          <w:rFonts w:ascii="TH SarabunPSK" w:hAnsi="TH SarabunPSK" w:cs="TH SarabunPSK" w:hint="cs"/>
+                          <w:b/>
+                          <w:bCs/>
+                          <w:sz w:val="32"/>
+                          <w:szCs w:val="32"/>
+                        </w:rPr>
+                      </w:pPr>
+                      <w:r>
+                        <w:rPr>
+                          <w:rFonts w:ascii="TH SarabunPSK" w:hAnsi="TH SarabunPSK" w:cs="TH SarabunPSK" w:hint="cs"/>
+                          <w:noProof/>
+                          <w:sz w:val="32"/>
+                          <w:szCs w:val="32"/>
+                          <w:cs/>
+                        </w:rPr>
+                        <w:t>ภาพที่ 4.10 หน้าจอประวัติการทำรายการย้อนหลัง</w:t>
+                      </w:r>
+                    </w:p>
+                  </w:txbxContent>
+                </v:textbox>
+              </v:shape>
+            </w:pict>
+          </mc:Fallback>
+        </mc:AlternateContent>
+      </w:r>
+      <w:r>
+        <w:rPr>
+          <w:rFonts w:ascii="TH SarabunPSK" w:hAnsi="TH SarabunPSK" w:cs="TH SarabunPSK"/>
+          <w:b/>
+          <w:bCs/>
+          <w:sz w:val="40"/>
+          <w:szCs w:val="40"/>
+          <w:cs/>
+        </w:rPr>
+        <w:drawing>
+          <wp:anchor distT="0" distB="0" distL="114300" distR="114300" simplePos="0" relativeHeight="251688960" behindDoc="0" locked="0" layoutInCell="1" allowOverlap="1" wp14:anchorId="566F75E5" wp14:editId="505F7B7F">
+            <wp:simplePos x="0" y="0"/>
+            <wp:positionH relativeFrom="margin">
+              <wp:align>center</wp:align>
+            </wp:positionH>
+            <wp:positionV relativeFrom="paragraph">
+              <wp:posOffset>4445</wp:posOffset>
+            </wp:positionV>
+            <wp:extent cx="5735955" cy="2440940"/>
+            <wp:effectExtent l="0" t="0" r="0" b="0"/>
+            <wp:wrapNone/>
+            <wp:docPr id="63039035" name="Picture 1"/>
+            <wp:cNvGraphicFramePr>
+              <a:graphicFrameLocks xmlns:a="http://schemas.openxmlformats.org/drawingml/2006/main" noChangeAspect="1"/>
+            </wp:cNvGraphicFramePr>
+            <a:graphic xmlns:a="http://schemas.openxmlformats.org/drawingml/2006/main">
+              <a:graphicData uri="http://schemas.openxmlformats.org/drawingml/2006/picture">
+                <pic:pic xmlns:pic="http://schemas.openxmlformats.org/drawingml/2006/picture">
+                  <pic:nvPicPr>
+                    <pic:cNvPr id="63039035" name=""/>
+                    <pic:cNvPicPr/>
+                  </pic:nvPicPr>
+                  <pic:blipFill rotWithShape="1">
+                    <a:blip r:embed="rId17">
+                      <a:extLst>
+                        <a:ext uri="{28A0092B-C50C-407E-A947-70E740481C1C}">
+                          <a14:useLocalDpi xmlns:a14="http://schemas.microsoft.com/office/drawing/2010/main" val="0"/>
+                        </a:ext>
+                      </a:extLst>
+                    </a:blip>
+                    <a:srcRect l="2468" t="3644" r="989" b="2596"/>
+                    <a:stretch>
+                      <a:fillRect/>
+                    </a:stretch>
+                  </pic:blipFill>
+                  <pic:spPr bwMode="auto">
+                    <a:xfrm>
+                      <a:off x="0" y="0"/>
+                      <a:ext cx="5735955" cy="2440940"/>
+                    </a:xfrm>
+                    <a:prstGeom prst="rect">
+                      <a:avLst/>
+                    </a:prstGeom>
+                    <a:ln>
+                      <a:noFill/>
+                    </a:ln>
+                    <a:extLst>
+                      <a:ext uri="{53640926-AAD7-44D8-BBD7-CCE9431645EC}">
+                        <a14:shadowObscured xmlns:a14="http://schemas.microsoft.com/office/drawing/2010/main"/>
+                      </a:ext>
+                    </a:extLst>
+                  </pic:spPr>
+                </pic:pic>
+              </a:graphicData>
+            </a:graphic>
+            <wp14:sizeRelH relativeFrom="margin">
+              <wp14:pctWidth>0</wp14:pctWidth>
+            </wp14:sizeRelH>
+            <wp14:sizeRelV relativeFrom="margin">
+              <wp14:pctHeight>0</wp14:pctHeight>
+            </wp14:sizeRelV>
+          </wp:anchor>
+        </w:drawing>
+      </w:r>
+    </w:p>
+    <w:p>
+      <w:pPr>
+        <w:jc w:val="center"/>
+        <w:rPr>
+          <w:rFonts w:ascii="TH SarabunPSK" w:hAnsi="TH SarabunPSK" w:cs="TH SarabunPSK"/>
+          <w:b/>
+          <w:bCs/>
+          <w:sz w:val="40"/>
+          <w:szCs w:val="40"/>
+        </w:rPr>
+      </w:pPr>
+    </w:p>
+    <w:p>
+      <w:pPr>
+        <w:jc w:val="center"/>
+        <w:rPr>
+          <w:rFonts w:ascii="TH SarabunPSK" w:hAnsi="TH SarabunPSK" w:cs="TH SarabunPSK"/>
+          <w:b/>
+          <w:bCs/>
+          <w:sz w:val="40"/>
+          <w:szCs w:val="40"/>
+        </w:rPr>
+      </w:pPr>
+    </w:p>
+    <w:p>
+      <w:pPr>
+        <w:jc w:val="center"/>
+        <w:rPr>
+          <w:rFonts w:ascii="TH SarabunPSK" w:hAnsi="TH SarabunPSK" w:cs="TH SarabunPSK"/>
+          <w:b/>
+          <w:bCs/>
+          <w:sz w:val="40"/>
+          <w:szCs w:val="40"/>
+        </w:rPr>
+      </w:pPr>
+    </w:p>
+    <w:p>
+      <w:pPr>
+        <w:jc w:val="center"/>
+        <w:rPr>
+          <w:rFonts w:ascii="TH SarabunPSK" w:hAnsi="TH SarabunPSK" w:cs="TH SarabunPSK"/>
+          <w:b/>
+          <w:bCs/>
+          <w:sz w:val="40"/>
+          <w:szCs w:val="40"/>
+        </w:rPr>
+      </w:pPr>
+    </w:p>
+    <w:p>
+      <w:pPr>
+        <w:jc w:val="center"/>
+        <w:rPr>
+          <w:rFonts w:ascii="TH SarabunPSK" w:hAnsi="TH SarabunPSK" w:cs="TH SarabunPSK"/>
+          <w:b/>
+          <w:bCs/>
+          <w:sz w:val="40"/>
+          <w:szCs w:val="40"/>
+        </w:rPr>
+      </w:pPr>
+    </w:p>
+    <w:p>
+      <w:pPr>
+        <w:jc w:val="center"/>
+        <w:rPr>
+          <w:rFonts w:ascii="TH SarabunPSK" w:hAnsi="TH SarabunPSK" w:cs="TH SarabunPSK"/>
+          <w:b/>
+          <w:bCs/>
+          <w:sz w:val="40"/>
+          <w:szCs w:val="40"/>
+        </w:rPr>
+      </w:pPr>
+    </w:p>
+    <w:p>
+      <w:pPr>
+        <w:jc w:val="center"/>
+        <w:rPr>
+          <w:rFonts w:ascii="TH SarabunPSK" w:hAnsi="TH SarabunPSK" w:cs="TH SarabunPSK"/>
+          <w:b/>
+          <w:bCs/>
+          <w:sz w:val="40"/>
+          <w:szCs w:val="40"/>
+        </w:rPr>
+      </w:pPr>
+    </w:p>
+    <w:p>
+      <w:pPr>
+        <w:jc w:val="center"/>
+        <w:rPr>
+          <w:rFonts w:ascii="TH SarabunPSK" w:hAnsi="TH SarabunPSK" w:cs="TH SarabunPSK"/>
+          <w:b/>
+          <w:bCs/>
+          <w:sz w:val="40"/>
+          <w:szCs w:val="40"/>
+        </w:rPr>
+      </w:pPr>
+    </w:p>
+    <w:p>
+      <w:pPr>
+        <w:jc w:val="center"/>
+        <w:rPr>
+          <w:rFonts w:ascii="TH SarabunPSK" w:hAnsi="TH SarabunPSK" w:cs="TH SarabunPSK"/>
+          <w:b/>
+          <w:bCs/>
+          <w:sz w:val="40"/>
+          <w:szCs w:val="40"/>
+        </w:rPr>
+      </w:pPr>
+    </w:p>
+    <w:p>
+      <w:pPr>
+        <w:jc w:val="center"/>
+        <w:rPr>
+          <w:rFonts w:ascii="TH SarabunPSK" w:hAnsi="TH SarabunPSK" w:cs="TH SarabunPSK"/>
+          <w:b/>
+          <w:bCs/>
+          <w:sz w:val="40"/>
+          <w:szCs w:val="40"/>
+        </w:rPr>
+      </w:pPr>
+    </w:p>
+    <w:p>
+      <w:pPr>
+        <w:jc w:val="center"/>
+        <w:rPr>
+          <w:rFonts w:ascii="TH SarabunPSK" w:hAnsi="TH SarabunPSK" w:cs="TH SarabunPSK"/>
+          <w:b/>
+          <w:bCs/>
+          <w:sz w:val="40"/>
+          <w:szCs w:val="40"/>
+        </w:rPr>
+      </w:pPr>
+    </w:p>
+    <w:p>
+      <w:pPr>
+        <w:jc w:val="center"/>
+        <w:rPr>
+          <w:rFonts w:ascii="TH SarabunPSK" w:hAnsi="TH SarabunPSK" w:cs="TH SarabunPSK"/>
+          <w:b/>
+          <w:bCs/>
+          <w:sz w:val="40"/>
+          <w:szCs w:val="40"/>
+        </w:rPr>
+      </w:pPr>
+    </w:p>
+    <w:p>
+      <w:pPr>
+        <w:jc w:val="center"/>
+        <w:rPr>
+          <w:rFonts w:ascii="TH SarabunPSK" w:hAnsi="TH SarabunPSK" w:cs="TH SarabunPSK"/>
+          <w:b/>
+          <w:bCs/>
+          <w:sz w:val="40"/>
+          <w:szCs w:val="40"/>
+        </w:rPr>
+      </w:pPr>
+    </w:p>
+    <w:p>
+      <w:pPr>
+        <w:jc w:val="center"/>
+        <w:rPr>
+          <w:rFonts w:ascii="TH SarabunPSK" w:hAnsi="TH SarabunPSK" w:cs="TH SarabunPSK"/>
+          <w:b/>
+          <w:bCs/>
+          <w:sz w:val="40"/>
+          <w:szCs w:val="40"/>
+        </w:rPr>
+      </w:pPr>
+    </w:p>
+    <w:p>
+      <w:pPr>
+        <w:jc w:val="center"/>
+        <w:rPr>
+          <w:rFonts w:ascii="TH SarabunPSK" w:hAnsi="TH SarabunPSK" w:cs="TH SarabunPSK"/>
+          <w:b/>
+          <w:bCs/>
+          <w:sz w:val="40"/>
+          <w:szCs w:val="40"/>
+        </w:rPr>
+      </w:pPr>
+    </w:p>
+    <w:p>
+      <w:pPr>
+        <w:jc w:val="center"/>
+        <w:rPr>
+          <w:rFonts w:ascii="TH SarabunPSK" w:hAnsi="TH SarabunPSK" w:cs="TH SarabunPSK"/>
+          <w:b/>
+          <w:bCs/>
+          <w:sz w:val="40"/>
+          <w:szCs w:val="40"/>
+        </w:rPr>
+      </w:pPr>
+      <w:r>
+        <w:rPr>
+          <w:rFonts w:ascii="TH SarabunPSK" w:hAnsi="TH SarabunPSK" w:cs="TH SarabunPSK" w:hint="cs"/>
+          <w:b/>
+          <w:bCs/>
+          <w:sz w:val="40"/>
+          <w:szCs w:val="40"/>
           <w:cs/>
         </w:rPr>
         <w:lastRenderedPageBreak/>
@@ -12185,7 +12580,16 @@
           <w:szCs w:val="32"/>
           <w:cs/>
         </w:rPr>
-        <w:t>เวอร์ชัน</w:t>
+        <w:t>เวอร์ชั่</w:t>
+      </w:r>
+      <w:r>
+        <w:rPr>
+          <w:rFonts w:ascii="TH SarabunPSK" w:hAnsi="TH SarabunPSK" w:cs="TH SarabunPSK"/>
+          <w:sz w:val="32"/>
+          <w:szCs w:val="32"/>
+          <w:cs/>
+        </w:rPr>
+        <w:t>น</w:t>
       </w:r>
       <w:proofErr w:type="spellEnd"/>
       <w:r>

</xml_diff>